<commit_message>
Final Resume in PDF
</commit_message>
<xml_diff>
--- a/cv.docx
+++ b/cv.docx
@@ -383,17 +383,19 @@
           <w:szCs w:val="20"/>
           <w:shd w:val="clear" w:color="auto" w:fill="FFFFFF"/>
         </w:rPr>
-        <w:t>Highly skilled and dedicated</w:t>
-      </w:r>
-      <w:r>
-        <w:rPr>
-          <w:rFonts w:ascii="Segoe UI" w:hAnsi="Segoe UI" w:cs="Segoe UI"/>
+        <w:t xml:space="preserve">Highly skilled and dedicated </w:t>
+      </w:r>
+      <w:r>
+        <w:rPr>
+          <w:rFonts w:ascii="Segoe UI" w:hAnsi="Segoe UI" w:cs="Segoe UI"/>
+          <w:b/>
+          <w:bCs/>
           <w:color w:val="46464E"/>
           <w:sz w:val="20"/>
           <w:szCs w:val="20"/>
           <w:shd w:val="clear" w:color="auto" w:fill="FFFFFF"/>
         </w:rPr>
-        <w:t xml:space="preserve"> </w:t>
+        <w:t>C#</w:t>
       </w:r>
       <w:r>
         <w:rPr>
@@ -405,7 +407,7 @@
           <w:szCs w:val="20"/>
           <w:shd w:val="clear" w:color="auto" w:fill="FFFFFF"/>
         </w:rPr>
-        <w:t>C#</w:t>
+        <w:t xml:space="preserve"> .</w:t>
       </w:r>
       <w:r>
         <w:rPr>
@@ -417,49 +419,17 @@
           <w:szCs w:val="20"/>
           <w:shd w:val="clear" w:color="auto" w:fill="FFFFFF"/>
         </w:rPr>
-        <w:t xml:space="preserve"> .</w:t>
-      </w:r>
-      <w:r>
-        <w:rPr>
-          <w:rFonts w:ascii="Segoe UI" w:hAnsi="Segoe UI" w:cs="Segoe UI"/>
-          <w:b/>
-          <w:bCs/>
+        <w:t>NET</w:t>
+      </w:r>
+      <w:r>
+        <w:rPr>
+          <w:rFonts w:ascii="Segoe UI" w:hAnsi="Segoe UI" w:cs="Segoe UI"/>
           <w:color w:val="46464E"/>
           <w:sz w:val="20"/>
           <w:szCs w:val="20"/>
           <w:shd w:val="clear" w:color="auto" w:fill="FFFFFF"/>
         </w:rPr>
-        <w:t>NET</w:t>
-      </w:r>
-      <w:r>
-        <w:rPr>
-          <w:rFonts w:ascii="Segoe UI" w:hAnsi="Segoe UI" w:cs="Segoe UI"/>
-          <w:color w:val="46464E"/>
-          <w:sz w:val="20"/>
-          <w:szCs w:val="20"/>
-          <w:shd w:val="clear" w:color="auto" w:fill="FFFFFF"/>
-        </w:rPr>
-        <w:t xml:space="preserve"> Software Enginee</w:t>
-      </w:r>
-      <w:r>
-        <w:rPr>
-          <w:rFonts w:ascii="Segoe UI" w:hAnsi="Segoe UI" w:cs="Segoe UI"/>
-          <w:color w:val="46464E"/>
-          <w:sz w:val="20"/>
-          <w:szCs w:val="20"/>
-          <w:shd w:val="clear" w:color="auto" w:fill="FFFFFF"/>
-        </w:rPr>
-        <w:t xml:space="preserve">r with a passion for developing </w:t>
-      </w:r>
-      <w:r>
-        <w:rPr>
-          <w:rFonts w:ascii="Segoe UI" w:hAnsi="Segoe UI" w:cs="Segoe UI"/>
-          <w:color w:val="46464E"/>
-          <w:sz w:val="20"/>
-          <w:szCs w:val="20"/>
-          <w:shd w:val="clear" w:color="auto" w:fill="FFFFFF"/>
-        </w:rPr>
-        <w:t xml:space="preserve">robust and scalable applications. Proficient in leveraging the </w:t>
+        <w:t xml:space="preserve"> Software Engineer with a passion for developing robust and scalable applications. Proficient in leveraging the </w:t>
       </w:r>
       <w:r>
         <w:rPr>
@@ -575,7 +545,7 @@
     <w:p>
       <w:pPr>
         <w:rPr>
-          <w:rFonts w:asciiTheme="majorBidi" w:hAnsiTheme="majorBidi" w:cstheme="majorBidi"/>
+          <w:rFonts w:ascii="Bahnschrift" w:hAnsi="Bahnschrift" w:cstheme="majorBidi"/>
           <w:b/>
           <w:bCs/>
           <w:sz w:val="24"/>
@@ -584,33 +554,13 @@
       </w:pPr>
       <w:r>
         <w:rPr>
-          <w:rFonts w:ascii="Bahnschrift Condensed" w:hAnsi="Bahnschrift Condensed"/>
+          <w:rFonts w:ascii="Bahnschrift" w:hAnsi="Bahnschrift"/>
           <w:b/>
           <w:bCs/>
           <w:sz w:val="24"/>
           <w:szCs w:val="24"/>
         </w:rPr>
-        <w:t>Student Management system (with Admin &amp; Stu</w:t>
-      </w:r>
-      <w:r>
-        <w:rPr>
-          <w:rFonts w:ascii="Bahnschrift Condensed" w:hAnsi="Bahnschrift Condensed"/>
-          <w:b/>
-          <w:bCs/>
-          <w:sz w:val="24"/>
-          <w:szCs w:val="24"/>
-        </w:rPr>
-        <w:t>dent Dashboard) | Govt college J</w:t>
-      </w:r>
-      <w:r>
-        <w:rPr>
-          <w:rFonts w:ascii="Bahnschrift Condensed" w:hAnsi="Bahnschrift Condensed"/>
-          <w:b/>
-          <w:bCs/>
-          <w:sz w:val="24"/>
-          <w:szCs w:val="24"/>
-        </w:rPr>
-        <w:t>hang Sadar | March 2023 - March 2023</w:t>
+        <w:t>Student Management system (with Admin &amp; Student Dashboard) | Govt college Jhang Sadar | March 2023 - March 2023</w:t>
       </w:r>
     </w:p>
     <w:p>
@@ -715,7 +665,7 @@
     <w:p>
       <w:pPr>
         <w:rPr>
-          <w:rFonts w:ascii="Bahnschrift Condensed" w:hAnsi="Bahnschrift Condensed"/>
+          <w:rFonts w:ascii="Bahnschrift" w:hAnsi="Bahnschrift"/>
           <w:b/>
           <w:bCs/>
           <w:sz w:val="24"/>
@@ -724,7 +674,7 @@
       </w:pPr>
       <w:r>
         <w:rPr>
-          <w:rFonts w:ascii="Bahnschrift Condensed" w:hAnsi="Bahnschrift Condensed"/>
+          <w:rFonts w:ascii="Bahnschrift" w:hAnsi="Bahnschrift"/>
           <w:b/>
           <w:bCs/>
           <w:sz w:val="24"/>
@@ -856,7 +806,7 @@
       <w:pPr>
         <w:spacing w:before="100" w:beforeAutospacing="1" w:after="100" w:afterAutospacing="1" w:line="240" w:lineRule="auto"/>
         <w:rPr>
-          <w:rFonts w:ascii="Open Sans" w:eastAsia="Times New Roman" w:hAnsi="Open Sans" w:cs="Open Sans"/>
+          <w:rFonts w:ascii="Bahnschrift" w:eastAsia="Times New Roman" w:hAnsi="Bahnschrift" w:cs="Open Sans"/>
           <w:color w:val="000000"/>
           <w:sz w:val="20"/>
           <w:szCs w:val="20"/>
@@ -864,7 +814,7 @@
       </w:pPr>
       <w:r>
         <w:rPr>
-          <w:rFonts w:ascii="Bahnschrift Condensed" w:hAnsi="Bahnschrift Condensed"/>
+          <w:rFonts w:ascii="Bahnschrift" w:hAnsi="Bahnschrift"/>
           <w:b/>
           <w:bCs/>
           <w:sz w:val="24"/>
@@ -996,7 +946,7 @@
       <w:pPr>
         <w:spacing w:before="100" w:beforeAutospacing="1" w:after="100" w:afterAutospacing="1" w:line="240" w:lineRule="auto"/>
         <w:rPr>
-          <w:rFonts w:ascii="Open Sans" w:eastAsia="Times New Roman" w:hAnsi="Open Sans" w:cs="Open Sans"/>
+          <w:rFonts w:ascii="Bahnschrift" w:eastAsia="Times New Roman" w:hAnsi="Bahnschrift" w:cs="Open Sans"/>
           <w:color w:val="000000"/>
           <w:sz w:val="20"/>
           <w:szCs w:val="20"/>
@@ -1004,7 +954,7 @@
       </w:pPr>
       <w:r>
         <w:rPr>
-          <w:rFonts w:ascii="Bahnschrift Condensed" w:hAnsi="Bahnschrift Condensed"/>
+          <w:rFonts w:ascii="Bahnschrift" w:hAnsi="Bahnschrift"/>
           <w:b/>
           <w:bCs/>
           <w:sz w:val="24"/>
@@ -1014,7 +964,7 @@
       </w:r>
       <w:r>
         <w:rPr>
-          <w:rFonts w:ascii="Bahnschrift Condensed" w:hAnsi="Bahnschrift Condensed"/>
+          <w:rFonts w:ascii="Bahnschrift" w:hAnsi="Bahnschrift"/>
           <w:b/>
           <w:bCs/>
           <w:sz w:val="24"/>
@@ -1024,7 +974,7 @@
       </w:r>
       <w:r>
         <w:rPr>
-          <w:rFonts w:ascii="Bahnschrift Condensed" w:hAnsi="Bahnschrift Condensed"/>
+          <w:rFonts w:ascii="Bahnschrift" w:hAnsi="Bahnschrift"/>
           <w:b/>
           <w:bCs/>
           <w:sz w:val="24"/>
@@ -1034,7 +984,7 @@
       </w:r>
       <w:r>
         <w:rPr>
-          <w:rFonts w:ascii="Bahnschrift Condensed" w:hAnsi="Bahnschrift Condensed"/>
+          <w:rFonts w:ascii="Bahnschrift" w:hAnsi="Bahnschrift"/>
           <w:b/>
           <w:bCs/>
           <w:sz w:val="24"/>
@@ -1205,7 +1155,7 @@
       <w:pPr>
         <w:spacing w:before="100" w:beforeAutospacing="1" w:after="100" w:afterAutospacing="1" w:line="240" w:lineRule="auto"/>
         <w:rPr>
-          <w:rFonts w:ascii="Bahnschrift Condensed" w:hAnsi="Bahnschrift Condensed"/>
+          <w:rFonts w:ascii="Bahnschrift" w:hAnsi="Bahnschrift"/>
           <w:b/>
           <w:bCs/>
           <w:sz w:val="24"/>
@@ -1214,7 +1164,7 @@
       </w:pPr>
       <w:r>
         <w:rPr>
-          <w:rFonts w:ascii="Bahnschrift Condensed" w:hAnsi="Bahnschrift Condensed"/>
+          <w:rFonts w:ascii="Bahnschrift" w:hAnsi="Bahnschrift"/>
           <w:b/>
           <w:bCs/>
           <w:sz w:val="24"/>
@@ -1224,7 +1174,7 @@
       </w:r>
       <w:r>
         <w:rPr>
-          <w:rFonts w:ascii="Bahnschrift Condensed" w:hAnsi="Bahnschrift Condensed"/>
+          <w:rFonts w:ascii="Bahnschrift" w:hAnsi="Bahnschrift"/>
           <w:b/>
           <w:bCs/>
           <w:sz w:val="24"/>
@@ -1234,7 +1184,7 @@
       </w:r>
       <w:r>
         <w:rPr>
-          <w:rFonts w:ascii="Bahnschrift Condensed" w:hAnsi="Bahnschrift Condensed"/>
+          <w:rFonts w:ascii="Bahnschrift" w:hAnsi="Bahnschrift"/>
           <w:b/>
           <w:bCs/>
           <w:sz w:val="24"/>
@@ -1264,50 +1214,1188 @@
           <w:sz w:val="20"/>
           <w:szCs w:val="20"/>
         </w:rPr>
-        <w:t>I have d</w:t>
-      </w:r>
-      <w:r>
-        <w:rPr>
-          <w:rFonts w:ascii="Segoe UI" w:hAnsi="Segoe UI" w:cs="Segoe UI"/>
-          <w:sz w:val="20"/>
-          <w:szCs w:val="20"/>
-        </w:rPr>
-        <w:t>evelop</w:t>
-      </w:r>
-      <w:r>
-        <w:rPr>
-          <w:rFonts w:ascii="Segoe UI" w:hAnsi="Segoe UI" w:cs="Segoe UI"/>
-          <w:sz w:val="20"/>
-          <w:szCs w:val="20"/>
-        </w:rPr>
-        <w:t>ed</w:t>
-      </w:r>
-      <w:r>
-        <w:rPr>
-          <w:rFonts w:ascii="Segoe UI" w:hAnsi="Segoe UI" w:cs="Segoe UI"/>
-          <w:sz w:val="20"/>
-          <w:szCs w:val="20"/>
-        </w:rPr>
-        <w:t xml:space="preserve"> different projects on the command line using C++ (OOP) and DSA (Da</w:t>
-      </w:r>
-      <w:r>
-        <w:rPr>
-          <w:rFonts w:ascii="Segoe UI" w:hAnsi="Segoe UI" w:cs="Segoe UI"/>
-          <w:sz w:val="20"/>
-          <w:szCs w:val="20"/>
-        </w:rPr>
-        <w:t xml:space="preserve">ta Structured and Algorithm). </w:t>
-      </w:r>
-      <w:r>
-        <w:rPr>
-          <w:rFonts w:ascii="Segoe UI" w:hAnsi="Segoe UI" w:cs="Segoe UI"/>
-          <w:sz w:val="20"/>
-          <w:szCs w:val="20"/>
-        </w:rPr>
-        <w:t>These projects are based on Real life problems Like Student management systems, Bank management systems, and Software for Players with different dashboards for users and admins with security protection.</w:t>
-      </w:r>
+        <w:t>I have developed different</w:t>
+      </w:r>
+      <w:r>
+        <w:rPr>
+          <w:rFonts w:ascii="Segoe UI" w:hAnsi="Segoe UI" w:cs="Segoe UI"/>
+          <w:sz w:val="20"/>
+          <w:szCs w:val="20"/>
+        </w:rPr>
+        <w:t xml:space="preserve"> Console</w:t>
+      </w:r>
+      <w:r>
+        <w:rPr>
+          <w:rFonts w:ascii="Segoe UI" w:hAnsi="Segoe UI" w:cs="Segoe UI"/>
+          <w:sz w:val="20"/>
+          <w:szCs w:val="20"/>
+        </w:rPr>
+        <w:t xml:space="preserve"> projects using </w:t>
+      </w:r>
+      <w:r>
+        <w:rPr>
+          <w:rFonts w:ascii="Segoe UI" w:hAnsi="Segoe UI" w:cs="Segoe UI"/>
+          <w:b/>
+          <w:bCs/>
+          <w:sz w:val="20"/>
+          <w:szCs w:val="20"/>
+        </w:rPr>
+        <w:t>C++ (OOP)</w:t>
+      </w:r>
+      <w:r>
+        <w:rPr>
+          <w:rFonts w:ascii="Segoe UI" w:hAnsi="Segoe UI" w:cs="Segoe UI"/>
+          <w:sz w:val="20"/>
+          <w:szCs w:val="20"/>
+        </w:rPr>
+        <w:t xml:space="preserve"> and </w:t>
+      </w:r>
+      <w:r>
+        <w:rPr>
+          <w:rFonts w:ascii="Segoe UI" w:hAnsi="Segoe UI" w:cs="Segoe UI"/>
+          <w:b/>
+          <w:bCs/>
+          <w:sz w:val="20"/>
+          <w:szCs w:val="20"/>
+        </w:rPr>
+        <w:t>DSA (Data Structured and Algorithm)</w:t>
+      </w:r>
+      <w:r>
+        <w:rPr>
+          <w:rFonts w:ascii="Segoe UI" w:hAnsi="Segoe UI" w:cs="Segoe UI"/>
+          <w:sz w:val="20"/>
+          <w:szCs w:val="20"/>
+        </w:rPr>
+        <w:t xml:space="preserve"> as well as GUI based Desktop applications in </w:t>
+      </w:r>
+      <w:r>
+        <w:rPr>
+          <w:rFonts w:ascii="Segoe UI" w:hAnsi="Segoe UI" w:cs="Segoe UI"/>
+          <w:b/>
+          <w:bCs/>
+          <w:sz w:val="20"/>
+          <w:szCs w:val="20"/>
+        </w:rPr>
+        <w:t>C# .NET Framework</w:t>
+      </w:r>
+      <w:r>
+        <w:rPr>
+          <w:rFonts w:ascii="Segoe UI" w:hAnsi="Segoe UI" w:cs="Segoe UI"/>
+          <w:sz w:val="20"/>
+          <w:szCs w:val="20"/>
+        </w:rPr>
+        <w:t xml:space="preserve">. </w:t>
+      </w:r>
+    </w:p>
+    <w:p>
+      <w:pPr>
+        <w:pStyle w:val="ListParagraph"/>
+        <w:numPr>
+          <w:ilvl w:val="0"/>
+          <w:numId w:val="5"/>
+        </w:numPr>
+        <w:spacing w:before="100" w:beforeAutospacing="1" w:after="100" w:afterAutospacing="1" w:line="240" w:lineRule="auto"/>
+        <w:rPr>
+          <w:rFonts w:ascii="Segoe UI" w:eastAsia="Times New Roman" w:hAnsi="Segoe UI" w:cs="Segoe UI"/>
+          <w:color w:val="000000"/>
+          <w:sz w:val="20"/>
+          <w:szCs w:val="20"/>
+        </w:rPr>
+      </w:pPr>
+      <w:r>
+        <w:rPr>
+          <w:rFonts w:ascii="Segoe UI" w:hAnsi="Segoe UI" w:cs="Segoe UI"/>
+          <w:sz w:val="20"/>
+          <w:szCs w:val="20"/>
+        </w:rPr>
+        <w:t xml:space="preserve">These projects are based on Real life problems Like Student management systems, </w:t>
+      </w:r>
+      <w:r>
+        <w:rPr>
+          <w:rFonts w:ascii="Segoe UI" w:hAnsi="Segoe UI" w:cs="Segoe UI"/>
+          <w:sz w:val="20"/>
+          <w:szCs w:val="20"/>
+        </w:rPr>
+        <w:t xml:space="preserve">Pharmacy Management System, Voting system and Weather apps and many more using </w:t>
+      </w:r>
+      <w:r>
+        <w:rPr>
+          <w:rFonts w:ascii="Segoe UI" w:hAnsi="Segoe UI" w:cs="Segoe UI"/>
+          <w:b/>
+          <w:bCs/>
+          <w:sz w:val="20"/>
+          <w:szCs w:val="20"/>
+        </w:rPr>
+        <w:t>API</w:t>
+      </w:r>
+      <w:r>
+        <w:rPr>
+          <w:rFonts w:ascii="Segoe UI" w:hAnsi="Segoe UI" w:cs="Segoe UI"/>
+          <w:sz w:val="20"/>
+          <w:szCs w:val="20"/>
+        </w:rPr>
+        <w:t xml:space="preserve"> and </w:t>
+      </w:r>
+      <w:r>
+        <w:rPr>
+          <w:rFonts w:ascii="Segoe UI" w:hAnsi="Segoe UI" w:cs="Segoe UI"/>
+          <w:b/>
+          <w:bCs/>
+          <w:sz w:val="20"/>
+          <w:szCs w:val="20"/>
+        </w:rPr>
+        <w:t>.NET</w:t>
+      </w:r>
+      <w:r>
+        <w:rPr>
+          <w:rFonts w:ascii="Segoe UI" w:hAnsi="Segoe UI" w:cs="Segoe UI"/>
+          <w:b/>
+          <w:bCs/>
+          <w:sz w:val="20"/>
+          <w:szCs w:val="20"/>
+        </w:rPr>
+        <w:t>.</w:t>
+      </w:r>
+    </w:p>
+    <w:p>
+      <w:pPr>
+        <w:pStyle w:val="ListParagraph"/>
+        <w:numPr>
+          <w:ilvl w:val="0"/>
+          <w:numId w:val="5"/>
+        </w:numPr>
+        <w:spacing w:before="100" w:beforeAutospacing="1" w:after="100" w:afterAutospacing="1" w:line="240" w:lineRule="auto"/>
+        <w:rPr>
+          <w:rFonts w:ascii="Segoe UI" w:eastAsia="Times New Roman" w:hAnsi="Segoe UI" w:cs="Segoe UI"/>
+          <w:color w:val="000000"/>
+          <w:sz w:val="20"/>
+          <w:szCs w:val="20"/>
+        </w:rPr>
+      </w:pPr>
+      <w:r>
+        <w:rPr>
+          <w:rFonts w:ascii="Segoe UI" w:hAnsi="Segoe UI" w:cs="Segoe UI"/>
+          <w:sz w:val="20"/>
+          <w:szCs w:val="20"/>
+        </w:rPr>
+        <w:t xml:space="preserve">These Projects also linked with </w:t>
+      </w:r>
+      <w:r>
+        <w:rPr>
+          <w:rFonts w:ascii="Segoe UI" w:hAnsi="Segoe UI" w:cs="Segoe UI"/>
+          <w:b/>
+          <w:bCs/>
+          <w:sz w:val="20"/>
+          <w:szCs w:val="20"/>
+        </w:rPr>
+        <w:t>SQL Server</w:t>
+      </w:r>
+      <w:r>
+        <w:rPr>
+          <w:rFonts w:ascii="Segoe UI" w:hAnsi="Segoe UI" w:cs="Segoe UI"/>
+          <w:sz w:val="20"/>
+          <w:szCs w:val="20"/>
+        </w:rPr>
+        <w:t xml:space="preserve"> database to store data permanently.</w:t>
+      </w:r>
+    </w:p>
+    <w:p>
+      <w:pPr>
+        <w:spacing w:before="100" w:beforeAutospacing="1" w:after="100" w:afterAutospacing="1" w:line="240" w:lineRule="auto"/>
+        <w:rPr>
+          <w:rFonts w:ascii="Bahnschrift" w:hAnsi="Bahnschrift"/>
+          <w:b/>
+          <w:bCs/>
+          <w:sz w:val="24"/>
+          <w:szCs w:val="24"/>
+        </w:rPr>
+      </w:pPr>
+      <w:r>
+        <w:rPr>
+          <w:rFonts w:ascii="Bahnschrift" w:hAnsi="Bahnschrift"/>
+          <w:b/>
+          <w:bCs/>
+          <w:sz w:val="24"/>
+          <w:szCs w:val="24"/>
+        </w:rPr>
+        <w:t>Video Editor | Bright Eaglets Colleges Jhang | Jan 2022- Dec 2022</w:t>
+      </w:r>
+    </w:p>
+    <w:p>
+      <w:pPr>
+        <w:pStyle w:val="ListParagraph"/>
+        <w:numPr>
+          <w:ilvl w:val="0"/>
+          <w:numId w:val="6"/>
+        </w:numPr>
+        <w:spacing w:before="100" w:beforeAutospacing="1" w:after="100" w:afterAutospacing="1" w:line="240" w:lineRule="auto"/>
+        <w:rPr>
+          <w:rFonts w:ascii="Segoe UI" w:eastAsia="Times New Roman" w:hAnsi="Segoe UI" w:cs="Segoe UI"/>
+          <w:color w:val="000000"/>
+          <w:sz w:val="20"/>
+          <w:szCs w:val="20"/>
+        </w:rPr>
+      </w:pPr>
+      <w:r>
+        <w:rPr>
+          <w:rFonts w:ascii="Segoe UI" w:hAnsi="Segoe UI" w:cs="Segoe UI"/>
+          <w:sz w:val="20"/>
+          <w:szCs w:val="20"/>
+        </w:rPr>
+        <w:lastRenderedPageBreak/>
+        <w:t xml:space="preserve">Edited footage for various YouTube channels and college Lectures using various software like </w:t>
+      </w:r>
+      <w:r>
+        <w:rPr>
+          <w:rFonts w:ascii="Segoe UI" w:hAnsi="Segoe UI" w:cs="Segoe UI"/>
+          <w:b/>
+          <w:bCs/>
+          <w:sz w:val="20"/>
+          <w:szCs w:val="20"/>
+        </w:rPr>
+        <w:t>Adobe Premiere Pro</w:t>
+      </w:r>
+      <w:r>
+        <w:rPr>
+          <w:rFonts w:ascii="Segoe UI" w:hAnsi="Segoe UI" w:cs="Segoe UI"/>
+          <w:sz w:val="20"/>
+          <w:szCs w:val="20"/>
+        </w:rPr>
+        <w:t xml:space="preserve">, </w:t>
+      </w:r>
+      <w:r>
+        <w:rPr>
+          <w:rFonts w:ascii="Segoe UI" w:hAnsi="Segoe UI" w:cs="Segoe UI"/>
+          <w:b/>
+          <w:bCs/>
+          <w:sz w:val="20"/>
+          <w:szCs w:val="20"/>
+        </w:rPr>
+        <w:t>Camtasia</w:t>
+      </w:r>
+      <w:r>
+        <w:rPr>
+          <w:rFonts w:ascii="Segoe UI" w:hAnsi="Segoe UI" w:cs="Segoe UI"/>
+          <w:sz w:val="20"/>
+          <w:szCs w:val="20"/>
+        </w:rPr>
+        <w:t xml:space="preserve">, and </w:t>
+      </w:r>
+      <w:r>
+        <w:rPr>
+          <w:rFonts w:ascii="Segoe UI" w:hAnsi="Segoe UI" w:cs="Segoe UI"/>
+          <w:b/>
+          <w:bCs/>
+          <w:sz w:val="20"/>
+          <w:szCs w:val="20"/>
+        </w:rPr>
+        <w:t>Filmora</w:t>
+      </w:r>
+      <w:r>
+        <w:rPr>
+          <w:rFonts w:ascii="Segoe UI" w:hAnsi="Segoe UI" w:cs="Segoe UI"/>
+          <w:sz w:val="20"/>
+          <w:szCs w:val="20"/>
+        </w:rPr>
+        <w:t>.</w:t>
+      </w:r>
+    </w:p>
+    <w:p>
+      <w:pPr>
+        <w:spacing w:before="100" w:beforeAutospacing="1" w:after="100" w:afterAutospacing="1" w:line="240" w:lineRule="auto"/>
+        <w:rPr>
+          <w:rFonts w:ascii="Bahnschrift" w:hAnsi="Bahnschrift"/>
+          <w:b/>
+          <w:bCs/>
+          <w:sz w:val="24"/>
+          <w:szCs w:val="24"/>
+        </w:rPr>
+      </w:pPr>
       <w:bookmarkStart w:id="0" w:name="_GoBack"/>
-      <w:bookmarkEnd w:id="0"/>
+      <w:r>
+        <w:rPr>
+          <w:rFonts w:ascii="Bahnschrift" w:hAnsi="Bahnschrift"/>
+          <w:b/>
+          <w:bCs/>
+          <w:sz w:val="24"/>
+          <w:szCs w:val="24"/>
+        </w:rPr>
+        <w:t>Web Developer | Bright Eaglets Colleges Jhang | Jan 20222- DEC 2022</w:t>
+      </w:r>
+    </w:p>
+    <w:bookmarkEnd w:id="0"/>
+    <w:p>
+      <w:pPr>
+        <w:pStyle w:val="ListParagraph"/>
+        <w:numPr>
+          <w:ilvl w:val="0"/>
+          <w:numId w:val="6"/>
+        </w:numPr>
+        <w:spacing w:before="100" w:beforeAutospacing="1" w:after="100" w:afterAutospacing="1" w:line="240" w:lineRule="auto"/>
+        <w:rPr>
+          <w:rFonts w:ascii="Segoe UI" w:eastAsia="Times New Roman" w:hAnsi="Segoe UI" w:cs="Segoe UI"/>
+          <w:color w:val="000000"/>
+          <w:sz w:val="20"/>
+          <w:szCs w:val="20"/>
+        </w:rPr>
+      </w:pPr>
+      <w:r>
+        <w:rPr>
+          <w:rFonts w:ascii="Segoe UI" w:hAnsi="Segoe UI" w:cs="Segoe UI"/>
+          <w:sz w:val="20"/>
+          <w:szCs w:val="20"/>
+        </w:rPr>
+        <w:t>During my Internship at the college I worked on different Programming Languages Like (</w:t>
+      </w:r>
+      <w:r>
+        <w:rPr>
+          <w:rFonts w:ascii="Segoe UI" w:hAnsi="Segoe UI" w:cs="Segoe UI"/>
+          <w:b/>
+          <w:bCs/>
+          <w:sz w:val="20"/>
+          <w:szCs w:val="20"/>
+        </w:rPr>
+        <w:t>HTML, CSS, and JavaScript</w:t>
+      </w:r>
+      <w:r>
+        <w:rPr>
+          <w:rFonts w:ascii="Segoe UI" w:hAnsi="Segoe UI" w:cs="Segoe UI"/>
+          <w:sz w:val="20"/>
+          <w:szCs w:val="20"/>
+        </w:rPr>
+        <w:t xml:space="preserve">) and also CSS frameworks like </w:t>
+      </w:r>
+      <w:r>
+        <w:rPr>
+          <w:rFonts w:ascii="Segoe UI" w:hAnsi="Segoe UI" w:cs="Segoe UI"/>
+          <w:b/>
+          <w:bCs/>
+          <w:sz w:val="20"/>
+          <w:szCs w:val="20"/>
+        </w:rPr>
+        <w:t>Bootstrap</w:t>
+      </w:r>
+      <w:r>
+        <w:rPr>
+          <w:rFonts w:ascii="Segoe UI" w:hAnsi="Segoe UI" w:cs="Segoe UI"/>
+          <w:sz w:val="20"/>
+          <w:szCs w:val="20"/>
+        </w:rPr>
+        <w:t xml:space="preserve">. </w:t>
+      </w:r>
+    </w:p>
+    <w:p>
+      <w:pPr>
+        <w:pStyle w:val="ListParagraph"/>
+        <w:numPr>
+          <w:ilvl w:val="0"/>
+          <w:numId w:val="6"/>
+        </w:numPr>
+        <w:spacing w:before="100" w:beforeAutospacing="1" w:after="100" w:afterAutospacing="1" w:line="240" w:lineRule="auto"/>
+        <w:rPr>
+          <w:rFonts w:ascii="Segoe UI" w:eastAsia="Times New Roman" w:hAnsi="Segoe UI" w:cs="Segoe UI"/>
+          <w:color w:val="000000"/>
+          <w:sz w:val="20"/>
+          <w:szCs w:val="20"/>
+        </w:rPr>
+      </w:pPr>
+      <w:r>
+        <w:rPr>
+          <w:rFonts w:ascii="Segoe UI" w:hAnsi="Segoe UI" w:cs="Segoe UI"/>
+          <w:sz w:val="20"/>
+          <w:szCs w:val="20"/>
+        </w:rPr>
+        <w:t xml:space="preserve">Also use PHP for just creating a database using </w:t>
+      </w:r>
+      <w:r>
+        <w:rPr>
+          <w:rFonts w:ascii="Segoe UI" w:hAnsi="Segoe UI" w:cs="Segoe UI"/>
+          <w:sz w:val="20"/>
+          <w:szCs w:val="20"/>
+        </w:rPr>
+        <w:t>My</w:t>
+      </w:r>
+      <w:r>
+        <w:rPr>
+          <w:rFonts w:ascii="Segoe UI" w:hAnsi="Segoe UI" w:cs="Segoe UI"/>
+          <w:sz w:val="20"/>
+          <w:szCs w:val="20"/>
+        </w:rPr>
+        <w:t xml:space="preserve">SQL. </w:t>
+      </w:r>
+    </w:p>
+    <w:p>
+      <w:pPr>
+        <w:pStyle w:val="ListParagraph"/>
+        <w:numPr>
+          <w:ilvl w:val="0"/>
+          <w:numId w:val="6"/>
+        </w:numPr>
+        <w:spacing w:before="100" w:beforeAutospacing="1" w:after="100" w:afterAutospacing="1" w:line="240" w:lineRule="auto"/>
+        <w:rPr>
+          <w:rFonts w:ascii="Segoe UI" w:eastAsia="Times New Roman" w:hAnsi="Segoe UI" w:cs="Segoe UI"/>
+          <w:color w:val="000000"/>
+          <w:sz w:val="20"/>
+          <w:szCs w:val="20"/>
+        </w:rPr>
+      </w:pPr>
+      <w:r>
+        <w:rPr>
+          <w:rFonts w:ascii="Segoe UI" w:hAnsi="Segoe UI" w:cs="Segoe UI"/>
+          <w:sz w:val="20"/>
+          <w:szCs w:val="20"/>
+        </w:rPr>
+        <w:t>During Web Development we have used different CMS (content management system)</w:t>
+      </w:r>
+      <w:r>
+        <w:rPr>
+          <w:rFonts w:ascii="Segoe UI" w:hAnsi="Segoe UI" w:cs="Segoe UI"/>
+          <w:sz w:val="20"/>
+          <w:szCs w:val="20"/>
+        </w:rPr>
+        <w:t xml:space="preserve"> Like </w:t>
+      </w:r>
+      <w:r>
+        <w:rPr>
+          <w:rFonts w:ascii="Segoe UI" w:hAnsi="Segoe UI" w:cs="Segoe UI"/>
+          <w:b/>
+          <w:bCs/>
+          <w:sz w:val="20"/>
+          <w:szCs w:val="20"/>
+        </w:rPr>
+        <w:t>Wordpress</w:t>
+      </w:r>
+      <w:r>
+        <w:rPr>
+          <w:rFonts w:ascii="Segoe UI" w:hAnsi="Segoe UI" w:cs="Segoe UI"/>
+          <w:b/>
+          <w:bCs/>
+          <w:sz w:val="20"/>
+          <w:szCs w:val="20"/>
+        </w:rPr>
+        <w:t>.</w:t>
+      </w:r>
+    </w:p>
+    <w:tbl>
+      <w:tblPr>
+        <w:tblStyle w:val="MediumList1"/>
+        <w:tblW w:w="0" w:type="auto"/>
+        <w:tblLook w:val="04A0" w:firstRow="1" w:lastRow="0" w:firstColumn="1" w:lastColumn="0" w:noHBand="0" w:noVBand="1"/>
+      </w:tblPr>
+      <w:tblGrid>
+        <w:gridCol w:w="9243"/>
+      </w:tblGrid>
+      <w:tr>
+        <w:trPr>
+          <w:cnfStyle w:val="100000000000" w:firstRow="1" w:lastRow="0" w:firstColumn="0" w:lastColumn="0" w:oddVBand="0" w:evenVBand="0" w:oddHBand="0" w:evenHBand="0" w:firstRowFirstColumn="0" w:firstRowLastColumn="0" w:lastRowFirstColumn="0" w:lastRowLastColumn="0"/>
+        </w:trPr>
+        <w:tc>
+          <w:tcPr>
+            <w:cnfStyle w:val="001000000000" w:firstRow="0" w:lastRow="0" w:firstColumn="1" w:lastColumn="0" w:oddVBand="0" w:evenVBand="0" w:oddHBand="0" w:evenHBand="0" w:firstRowFirstColumn="0" w:firstRowLastColumn="0" w:lastRowFirstColumn="0" w:lastRowLastColumn="0"/>
+            <w:tcW w:w="9243" w:type="dxa"/>
+            <w:tcBorders>
+              <w:bottom w:val="single" w:sz="12" w:space="0" w:color="auto"/>
+            </w:tcBorders>
+          </w:tcPr>
+          <w:p>
+            <w:pPr>
+              <w:spacing w:before="100" w:beforeAutospacing="1" w:after="100" w:afterAutospacing="1"/>
+              <w:rPr>
+                <w:rFonts w:ascii="Segoe UI" w:eastAsia="Times New Roman" w:hAnsi="Segoe UI" w:cs="Segoe UI"/>
+                <w:color w:val="000000"/>
+                <w:sz w:val="28"/>
+                <w:szCs w:val="28"/>
+              </w:rPr>
+            </w:pPr>
+            <w:r>
+              <w:rPr>
+                <w:rFonts w:ascii="Segoe UI" w:eastAsia="Times New Roman" w:hAnsi="Segoe UI" w:cs="Segoe UI"/>
+                <w:color w:val="000000"/>
+                <w:sz w:val="28"/>
+                <w:szCs w:val="28"/>
+              </w:rPr>
+              <w:t>EDUCATION</w:t>
+            </w:r>
+          </w:p>
+        </w:tc>
+      </w:tr>
+    </w:tbl>
+    <w:tbl>
+      <w:tblPr>
+        <w:tblStyle w:val="TableGrid"/>
+        <w:tblpPr w:leftFromText="180" w:rightFromText="180" w:vertAnchor="text" w:horzAnchor="margin" w:tblpX="-162" w:tblpY="450"/>
+        <w:tblW w:w="10188" w:type="dxa"/>
+        <w:tblLayout w:type="fixed"/>
+        <w:tblLook w:val="04A0" w:firstRow="1" w:lastRow="0" w:firstColumn="1" w:lastColumn="0" w:noHBand="0" w:noVBand="1"/>
+      </w:tblPr>
+      <w:tblGrid>
+        <w:gridCol w:w="2426"/>
+        <w:gridCol w:w="2336"/>
+        <w:gridCol w:w="2186"/>
+        <w:gridCol w:w="1350"/>
+        <w:gridCol w:w="1890"/>
+      </w:tblGrid>
+      <w:tr>
+        <w:trPr>
+          <w:trHeight w:val="306"/>
+        </w:trPr>
+        <w:tc>
+          <w:tcPr>
+            <w:tcW w:w="2426" w:type="dxa"/>
+          </w:tcPr>
+          <w:p>
+            <w:pPr>
+              <w:spacing w:before="100" w:beforeAutospacing="1" w:after="100" w:afterAutospacing="1"/>
+              <w:jc w:val="center"/>
+              <w:rPr>
+                <w:rFonts w:ascii="Segoe UI" w:hAnsi="Segoe UI" w:cs="Segoe UI"/>
+                <w:b/>
+                <w:bCs/>
+              </w:rPr>
+            </w:pPr>
+            <w:r>
+              <w:rPr>
+                <w:rFonts w:ascii="Segoe UI" w:hAnsi="Segoe UI" w:cs="Segoe UI"/>
+                <w:b/>
+                <w:bCs/>
+              </w:rPr>
+              <w:t>Degree</w:t>
+            </w:r>
+          </w:p>
+        </w:tc>
+        <w:tc>
+          <w:tcPr>
+            <w:tcW w:w="2336" w:type="dxa"/>
+          </w:tcPr>
+          <w:p>
+            <w:pPr>
+              <w:spacing w:before="100" w:beforeAutospacing="1" w:after="100" w:afterAutospacing="1"/>
+              <w:jc w:val="center"/>
+              <w:rPr>
+                <w:rFonts w:ascii="Segoe UI" w:hAnsi="Segoe UI" w:cs="Segoe UI"/>
+                <w:b/>
+                <w:bCs/>
+              </w:rPr>
+            </w:pPr>
+            <w:r>
+              <w:rPr>
+                <w:rFonts w:ascii="Segoe UI" w:hAnsi="Segoe UI" w:cs="Segoe UI"/>
+                <w:b/>
+                <w:bCs/>
+              </w:rPr>
+              <w:t>Subject</w:t>
+            </w:r>
+          </w:p>
+        </w:tc>
+        <w:tc>
+          <w:tcPr>
+            <w:tcW w:w="2186" w:type="dxa"/>
+          </w:tcPr>
+          <w:p>
+            <w:pPr>
+              <w:spacing w:before="100" w:beforeAutospacing="1" w:after="100" w:afterAutospacing="1"/>
+              <w:jc w:val="center"/>
+              <w:rPr>
+                <w:rFonts w:ascii="Segoe UI" w:hAnsi="Segoe UI" w:cs="Segoe UI"/>
+                <w:b/>
+                <w:bCs/>
+              </w:rPr>
+            </w:pPr>
+            <w:r>
+              <w:rPr>
+                <w:rFonts w:ascii="Segoe UI" w:hAnsi="Segoe UI" w:cs="Segoe UI"/>
+                <w:b/>
+                <w:bCs/>
+              </w:rPr>
+              <w:t xml:space="preserve">Passing </w:t>
+            </w:r>
+            <w:r>
+              <w:rPr>
+                <w:rFonts w:ascii="Segoe UI" w:hAnsi="Segoe UI" w:cs="Segoe UI"/>
+                <w:b/>
+                <w:bCs/>
+              </w:rPr>
+              <w:t>Year</w:t>
+            </w:r>
+          </w:p>
+        </w:tc>
+        <w:tc>
+          <w:tcPr>
+            <w:tcW w:w="1350" w:type="dxa"/>
+          </w:tcPr>
+          <w:p>
+            <w:pPr>
+              <w:spacing w:before="100" w:beforeAutospacing="1" w:after="100" w:afterAutospacing="1"/>
+              <w:jc w:val="center"/>
+              <w:rPr>
+                <w:rFonts w:ascii="Segoe UI" w:hAnsi="Segoe UI" w:cs="Segoe UI"/>
+                <w:b/>
+                <w:bCs/>
+              </w:rPr>
+            </w:pPr>
+            <w:r>
+              <w:rPr>
+                <w:rFonts w:ascii="Segoe UI" w:hAnsi="Segoe UI" w:cs="Segoe UI"/>
+                <w:b/>
+                <w:bCs/>
+              </w:rPr>
+              <w:t>Marks</w:t>
+            </w:r>
+          </w:p>
+        </w:tc>
+        <w:tc>
+          <w:tcPr>
+            <w:tcW w:w="1890" w:type="dxa"/>
+          </w:tcPr>
+          <w:p>
+            <w:pPr>
+              <w:spacing w:before="100" w:beforeAutospacing="1" w:after="100" w:afterAutospacing="1"/>
+              <w:jc w:val="center"/>
+              <w:rPr>
+                <w:rFonts w:ascii="Segoe UI" w:hAnsi="Segoe UI" w:cs="Segoe UI"/>
+                <w:b/>
+                <w:bCs/>
+              </w:rPr>
+            </w:pPr>
+            <w:r>
+              <w:rPr>
+                <w:rFonts w:ascii="Segoe UI" w:hAnsi="Segoe UI" w:cs="Segoe UI"/>
+                <w:b/>
+                <w:bCs/>
+              </w:rPr>
+              <w:t>Board</w:t>
+            </w:r>
+          </w:p>
+        </w:tc>
+      </w:tr>
+      <w:tr>
+        <w:trPr>
+          <w:trHeight w:val="321"/>
+        </w:trPr>
+        <w:tc>
+          <w:tcPr>
+            <w:tcW w:w="2426" w:type="dxa"/>
+          </w:tcPr>
+          <w:p>
+            <w:pPr>
+              <w:spacing w:before="100" w:beforeAutospacing="1" w:after="100" w:afterAutospacing="1"/>
+              <w:jc w:val="center"/>
+              <w:rPr>
+                <w:rFonts w:ascii="Segoe UI" w:hAnsi="Segoe UI" w:cs="Segoe UI"/>
+              </w:rPr>
+            </w:pPr>
+            <w:r>
+              <w:rPr>
+                <w:rFonts w:ascii="Segoe UI" w:hAnsi="Segoe UI" w:cs="Segoe UI"/>
+              </w:rPr>
+              <w:t>Matriculation</w:t>
+            </w:r>
+          </w:p>
+        </w:tc>
+        <w:tc>
+          <w:tcPr>
+            <w:tcW w:w="2336" w:type="dxa"/>
+          </w:tcPr>
+          <w:p>
+            <w:pPr>
+              <w:spacing w:before="100" w:beforeAutospacing="1" w:after="100" w:afterAutospacing="1"/>
+              <w:jc w:val="center"/>
+              <w:rPr>
+                <w:rFonts w:ascii="Segoe UI" w:hAnsi="Segoe UI" w:cs="Segoe UI"/>
+              </w:rPr>
+            </w:pPr>
+            <w:r>
+              <w:rPr>
+                <w:rFonts w:ascii="Segoe UI" w:hAnsi="Segoe UI" w:cs="Segoe UI"/>
+              </w:rPr>
+              <w:t>Science</w:t>
+            </w:r>
+          </w:p>
+        </w:tc>
+        <w:tc>
+          <w:tcPr>
+            <w:tcW w:w="2186" w:type="dxa"/>
+          </w:tcPr>
+          <w:p>
+            <w:pPr>
+              <w:spacing w:before="100" w:beforeAutospacing="1" w:after="100" w:afterAutospacing="1"/>
+              <w:jc w:val="center"/>
+              <w:rPr>
+                <w:rFonts w:ascii="Segoe UI" w:hAnsi="Segoe UI" w:cs="Segoe UI"/>
+              </w:rPr>
+            </w:pPr>
+            <w:r>
+              <w:rPr>
+                <w:rFonts w:ascii="Segoe UI" w:hAnsi="Segoe UI" w:cs="Segoe UI"/>
+              </w:rPr>
+              <w:t>2019</w:t>
+            </w:r>
+          </w:p>
+        </w:tc>
+        <w:tc>
+          <w:tcPr>
+            <w:tcW w:w="1350" w:type="dxa"/>
+          </w:tcPr>
+          <w:p>
+            <w:pPr>
+              <w:spacing w:before="100" w:beforeAutospacing="1" w:after="100" w:afterAutospacing="1"/>
+              <w:jc w:val="center"/>
+              <w:rPr>
+                <w:rFonts w:ascii="Segoe UI" w:hAnsi="Segoe UI" w:cs="Segoe UI"/>
+              </w:rPr>
+            </w:pPr>
+            <w:r>
+              <w:rPr>
+                <w:rFonts w:ascii="Segoe UI" w:hAnsi="Segoe UI" w:cs="Segoe UI"/>
+              </w:rPr>
+              <w:t>907</w:t>
+            </w:r>
+          </w:p>
+        </w:tc>
+        <w:tc>
+          <w:tcPr>
+            <w:tcW w:w="1890" w:type="dxa"/>
+          </w:tcPr>
+          <w:p>
+            <w:pPr>
+              <w:spacing w:before="100" w:beforeAutospacing="1" w:after="100" w:afterAutospacing="1"/>
+              <w:jc w:val="center"/>
+              <w:rPr>
+                <w:rFonts w:ascii="Segoe UI" w:hAnsi="Segoe UI" w:cs="Segoe UI"/>
+              </w:rPr>
+            </w:pPr>
+            <w:r>
+              <w:rPr>
+                <w:rFonts w:ascii="Segoe UI" w:hAnsi="Segoe UI" w:cs="Segoe UI"/>
+              </w:rPr>
+              <w:t xml:space="preserve">BISE </w:t>
+            </w:r>
+            <w:r>
+              <w:t xml:space="preserve"> </w:t>
+            </w:r>
+            <w:r>
+              <w:rPr>
+                <w:rFonts w:ascii="Segoe UI" w:hAnsi="Segoe UI" w:cs="Segoe UI"/>
+              </w:rPr>
+              <w:t>Faisalabad</w:t>
+            </w:r>
+          </w:p>
+        </w:tc>
+      </w:tr>
+      <w:tr>
+        <w:trPr>
+          <w:trHeight w:val="327"/>
+        </w:trPr>
+        <w:tc>
+          <w:tcPr>
+            <w:tcW w:w="2426" w:type="dxa"/>
+          </w:tcPr>
+          <w:p>
+            <w:pPr>
+              <w:spacing w:before="100" w:beforeAutospacing="1" w:after="100" w:afterAutospacing="1"/>
+              <w:jc w:val="center"/>
+              <w:rPr>
+                <w:rFonts w:ascii="Segoe UI" w:hAnsi="Segoe UI" w:cs="Segoe UI"/>
+              </w:rPr>
+            </w:pPr>
+            <w:r>
+              <w:rPr>
+                <w:rFonts w:ascii="Segoe UI" w:hAnsi="Segoe UI" w:cs="Segoe UI"/>
+              </w:rPr>
+              <w:t>Intermediate</w:t>
+            </w:r>
+          </w:p>
+        </w:tc>
+        <w:tc>
+          <w:tcPr>
+            <w:tcW w:w="2336" w:type="dxa"/>
+          </w:tcPr>
+          <w:p>
+            <w:pPr>
+              <w:spacing w:before="100" w:beforeAutospacing="1" w:after="100" w:afterAutospacing="1"/>
+              <w:jc w:val="center"/>
+              <w:rPr>
+                <w:rFonts w:ascii="Segoe UI" w:hAnsi="Segoe UI" w:cs="Segoe UI"/>
+              </w:rPr>
+            </w:pPr>
+            <w:r>
+              <w:rPr>
+                <w:rFonts w:ascii="Segoe UI" w:hAnsi="Segoe UI" w:cs="Segoe UI"/>
+              </w:rPr>
+              <w:t>Pre-Engineering</w:t>
+            </w:r>
+          </w:p>
+        </w:tc>
+        <w:tc>
+          <w:tcPr>
+            <w:tcW w:w="2186" w:type="dxa"/>
+          </w:tcPr>
+          <w:p>
+            <w:pPr>
+              <w:spacing w:before="100" w:beforeAutospacing="1" w:after="100" w:afterAutospacing="1"/>
+              <w:jc w:val="center"/>
+              <w:rPr>
+                <w:rFonts w:ascii="Segoe UI" w:hAnsi="Segoe UI" w:cs="Segoe UI"/>
+              </w:rPr>
+            </w:pPr>
+            <w:r>
+              <w:rPr>
+                <w:rFonts w:ascii="Segoe UI" w:hAnsi="Segoe UI" w:cs="Segoe UI"/>
+              </w:rPr>
+              <w:t>2021</w:t>
+            </w:r>
+          </w:p>
+        </w:tc>
+        <w:tc>
+          <w:tcPr>
+            <w:tcW w:w="1350" w:type="dxa"/>
+          </w:tcPr>
+          <w:p>
+            <w:pPr>
+              <w:spacing w:before="100" w:beforeAutospacing="1" w:after="100" w:afterAutospacing="1"/>
+              <w:jc w:val="center"/>
+              <w:rPr>
+                <w:rFonts w:ascii="Segoe UI" w:hAnsi="Segoe UI" w:cs="Segoe UI"/>
+              </w:rPr>
+            </w:pPr>
+            <w:r>
+              <w:rPr>
+                <w:rFonts w:ascii="Segoe UI" w:hAnsi="Segoe UI" w:cs="Segoe UI"/>
+              </w:rPr>
+              <w:t>939</w:t>
+            </w:r>
+          </w:p>
+        </w:tc>
+        <w:tc>
+          <w:tcPr>
+            <w:tcW w:w="1890" w:type="dxa"/>
+          </w:tcPr>
+          <w:p>
+            <w:pPr>
+              <w:spacing w:before="100" w:beforeAutospacing="1" w:after="100" w:afterAutospacing="1"/>
+              <w:jc w:val="center"/>
+              <w:rPr>
+                <w:rFonts w:ascii="Segoe UI" w:hAnsi="Segoe UI" w:cs="Segoe UI"/>
+              </w:rPr>
+            </w:pPr>
+            <w:r>
+              <w:rPr>
+                <w:rFonts w:ascii="Segoe UI" w:hAnsi="Segoe UI" w:cs="Segoe UI"/>
+              </w:rPr>
+              <w:t xml:space="preserve">BISE </w:t>
+            </w:r>
+            <w:r>
+              <w:t xml:space="preserve"> </w:t>
+            </w:r>
+            <w:r>
+              <w:rPr>
+                <w:rFonts w:ascii="Segoe UI" w:hAnsi="Segoe UI" w:cs="Segoe UI"/>
+              </w:rPr>
+              <w:t>Faisalabad</w:t>
+            </w:r>
+          </w:p>
+        </w:tc>
+      </w:tr>
+      <w:tr>
+        <w:trPr>
+          <w:trHeight w:val="327"/>
+        </w:trPr>
+        <w:tc>
+          <w:tcPr>
+            <w:tcW w:w="2426" w:type="dxa"/>
+          </w:tcPr>
+          <w:p>
+            <w:pPr>
+              <w:spacing w:before="100" w:beforeAutospacing="1" w:after="100" w:afterAutospacing="1"/>
+              <w:jc w:val="center"/>
+              <w:rPr>
+                <w:rFonts w:ascii="Segoe UI" w:hAnsi="Segoe UI" w:cs="Segoe UI"/>
+              </w:rPr>
+            </w:pPr>
+            <w:r>
+              <w:rPr>
+                <w:rFonts w:ascii="Segoe UI" w:hAnsi="Segoe UI" w:cs="Segoe UI"/>
+              </w:rPr>
+              <w:t>Bachelor</w:t>
+            </w:r>
+          </w:p>
+        </w:tc>
+        <w:tc>
+          <w:tcPr>
+            <w:tcW w:w="2336" w:type="dxa"/>
+          </w:tcPr>
+          <w:p>
+            <w:pPr>
+              <w:spacing w:before="100" w:beforeAutospacing="1" w:after="100" w:afterAutospacing="1"/>
+              <w:jc w:val="center"/>
+              <w:rPr>
+                <w:rFonts w:ascii="Segoe UI" w:hAnsi="Segoe UI" w:cs="Segoe UI"/>
+              </w:rPr>
+            </w:pPr>
+            <w:r>
+              <w:rPr>
+                <w:rFonts w:ascii="Segoe UI" w:hAnsi="Segoe UI" w:cs="Segoe UI"/>
+              </w:rPr>
+              <w:t>Computer Science</w:t>
+            </w:r>
+          </w:p>
+        </w:tc>
+        <w:tc>
+          <w:tcPr>
+            <w:tcW w:w="2186" w:type="dxa"/>
+          </w:tcPr>
+          <w:p>
+            <w:pPr>
+              <w:spacing w:before="100" w:beforeAutospacing="1" w:after="100" w:afterAutospacing="1"/>
+              <w:jc w:val="center"/>
+              <w:rPr>
+                <w:rFonts w:ascii="Segoe UI" w:hAnsi="Segoe UI" w:cs="Segoe UI"/>
+              </w:rPr>
+            </w:pPr>
+            <w:r>
+              <w:rPr>
+                <w:rFonts w:ascii="Segoe UI" w:hAnsi="Segoe UI" w:cs="Segoe UI"/>
+              </w:rPr>
+              <w:t>2025</w:t>
+            </w:r>
+          </w:p>
+        </w:tc>
+        <w:tc>
+          <w:tcPr>
+            <w:tcW w:w="1350" w:type="dxa"/>
+          </w:tcPr>
+          <w:p>
+            <w:pPr>
+              <w:spacing w:before="100" w:beforeAutospacing="1" w:after="100" w:afterAutospacing="1"/>
+              <w:jc w:val="center"/>
+              <w:rPr>
+                <w:rFonts w:ascii="Segoe UI" w:hAnsi="Segoe UI" w:cs="Segoe UI"/>
+              </w:rPr>
+            </w:pPr>
+            <w:r>
+              <w:rPr>
+                <w:rFonts w:ascii="Segoe UI" w:hAnsi="Segoe UI" w:cs="Segoe UI"/>
+              </w:rPr>
+              <w:t>Continue</w:t>
+            </w:r>
+          </w:p>
+        </w:tc>
+        <w:tc>
+          <w:tcPr>
+            <w:tcW w:w="1890" w:type="dxa"/>
+          </w:tcPr>
+          <w:p>
+            <w:pPr>
+              <w:spacing w:before="100" w:beforeAutospacing="1" w:after="100" w:afterAutospacing="1"/>
+              <w:jc w:val="center"/>
+              <w:rPr>
+                <w:rFonts w:ascii="Segoe UI" w:hAnsi="Segoe UI" w:cs="Segoe UI"/>
+              </w:rPr>
+            </w:pPr>
+            <w:r>
+              <w:rPr>
+                <w:rFonts w:ascii="Segoe UI" w:hAnsi="Segoe UI" w:cs="Segoe UI"/>
+              </w:rPr>
+              <w:t xml:space="preserve">BISE </w:t>
+            </w:r>
+            <w:r>
+              <w:t xml:space="preserve"> </w:t>
+            </w:r>
+            <w:r>
+              <w:rPr>
+                <w:rFonts w:ascii="Segoe UI" w:hAnsi="Segoe UI" w:cs="Segoe UI"/>
+              </w:rPr>
+              <w:t>Faisalabad</w:t>
+            </w:r>
+          </w:p>
+        </w:tc>
+      </w:tr>
+    </w:tbl>
+    <w:p>
+      <w:pPr>
+        <w:spacing w:before="100" w:beforeAutospacing="1" w:after="100" w:afterAutospacing="1" w:line="240" w:lineRule="auto"/>
+        <w:rPr>
+          <w:rFonts w:ascii="Segoe UI" w:hAnsi="Segoe UI" w:cs="Segoe UI"/>
+        </w:rPr>
+      </w:pPr>
+    </w:p>
+    <w:tbl>
+      <w:tblPr>
+        <w:tblStyle w:val="MediumList1"/>
+        <w:tblW w:w="0" w:type="auto"/>
+        <w:tblLook w:val="04A0" w:firstRow="1" w:lastRow="0" w:firstColumn="1" w:lastColumn="0" w:noHBand="0" w:noVBand="1"/>
+      </w:tblPr>
+      <w:tblGrid>
+        <w:gridCol w:w="9243"/>
+      </w:tblGrid>
+      <w:tr>
+        <w:trPr>
+          <w:cnfStyle w:val="100000000000" w:firstRow="1" w:lastRow="0" w:firstColumn="0" w:lastColumn="0" w:oddVBand="0" w:evenVBand="0" w:oddHBand="0" w:evenHBand="0" w:firstRowFirstColumn="0" w:firstRowLastColumn="0" w:lastRowFirstColumn="0" w:lastRowLastColumn="0"/>
+        </w:trPr>
+        <w:tc>
+          <w:tcPr>
+            <w:cnfStyle w:val="001000000000" w:firstRow="0" w:lastRow="0" w:firstColumn="1" w:lastColumn="0" w:oddVBand="0" w:evenVBand="0" w:oddHBand="0" w:evenHBand="0" w:firstRowFirstColumn="0" w:firstRowLastColumn="0" w:lastRowFirstColumn="0" w:lastRowLastColumn="0"/>
+            <w:tcW w:w="9243" w:type="dxa"/>
+            <w:tcBorders>
+              <w:bottom w:val="single" w:sz="12" w:space="0" w:color="auto"/>
+            </w:tcBorders>
+          </w:tcPr>
+          <w:p>
+            <w:pPr>
+              <w:spacing w:before="100" w:beforeAutospacing="1" w:after="100" w:afterAutospacing="1"/>
+              <w:rPr>
+                <w:rFonts w:ascii="Segoe UI" w:hAnsi="Segoe UI" w:cs="Segoe UI"/>
+                <w:sz w:val="28"/>
+                <w:szCs w:val="28"/>
+              </w:rPr>
+            </w:pPr>
+            <w:r>
+              <w:rPr>
+                <w:rFonts w:ascii="Segoe UI" w:hAnsi="Segoe UI" w:cs="Segoe UI"/>
+                <w:sz w:val="28"/>
+                <w:szCs w:val="28"/>
+              </w:rPr>
+              <w:t>Skills</w:t>
+            </w:r>
+          </w:p>
+        </w:tc>
+      </w:tr>
+    </w:tbl>
+    <w:p>
+      <w:pPr>
+        <w:pStyle w:val="ListParagraph"/>
+        <w:numPr>
+          <w:ilvl w:val="0"/>
+          <w:numId w:val="9"/>
+        </w:numPr>
+        <w:spacing w:before="100" w:beforeAutospacing="1" w:after="100" w:afterAutospacing="1" w:line="240" w:lineRule="auto"/>
+        <w:rPr>
+          <w:rFonts w:ascii="Segoe UI" w:hAnsi="Segoe UI" w:cs="Segoe UI"/>
+        </w:rPr>
+      </w:pPr>
+      <w:r>
+        <w:rPr>
+          <w:b/>
+          <w:bCs/>
+        </w:rPr>
+        <w:t>Programming:</w:t>
+      </w:r>
+      <w:r>
+        <w:t xml:space="preserve"> Proficient in </w:t>
+      </w:r>
+      <w:r>
+        <w:rPr>
+          <w:b/>
+          <w:bCs/>
+        </w:rPr>
+        <w:t>C# .NET Framework, C++</w:t>
+      </w:r>
+      <w:r>
+        <w:t xml:space="preserve"> with </w:t>
+      </w:r>
+      <w:r>
+        <w:rPr>
+          <w:b/>
+          <w:bCs/>
+        </w:rPr>
+        <w:t>DSA</w:t>
+      </w:r>
+      <w:r>
+        <w:t xml:space="preserve">, as well </w:t>
+      </w:r>
+      <w:r>
+        <w:t>as HTML, CSS, and JavaScript.</w:t>
+      </w:r>
+    </w:p>
+    <w:p>
+      <w:pPr>
+        <w:pStyle w:val="ListParagraph"/>
+        <w:numPr>
+          <w:ilvl w:val="0"/>
+          <w:numId w:val="9"/>
+        </w:numPr>
+        <w:spacing w:before="100" w:beforeAutospacing="1" w:after="100" w:afterAutospacing="1" w:line="240" w:lineRule="auto"/>
+        <w:rPr>
+          <w:rFonts w:ascii="Segoe UI" w:hAnsi="Segoe UI" w:cs="Segoe UI"/>
+        </w:rPr>
+      </w:pPr>
+      <w:r>
+        <w:rPr>
+          <w:b/>
+          <w:bCs/>
+        </w:rPr>
+        <w:t>Database:</w:t>
+      </w:r>
+      <w:r>
+        <w:rPr>
+          <w:rFonts w:ascii="Segoe UI" w:hAnsi="Segoe UI" w:cs="Segoe UI"/>
+        </w:rPr>
+        <w:t xml:space="preserve"> SQL Server</w:t>
+      </w:r>
+      <w:r>
+        <w:rPr>
+          <w:rFonts w:ascii="Segoe UI" w:hAnsi="Segoe UI" w:cs="Segoe UI"/>
+        </w:rPr>
+        <w:t>.</w:t>
+      </w:r>
+    </w:p>
+    <w:p>
+      <w:pPr>
+        <w:pStyle w:val="ListParagraph"/>
+        <w:numPr>
+          <w:ilvl w:val="0"/>
+          <w:numId w:val="9"/>
+        </w:numPr>
+        <w:spacing w:before="100" w:beforeAutospacing="1" w:after="100" w:afterAutospacing="1" w:line="240" w:lineRule="auto"/>
+        <w:rPr>
+          <w:rFonts w:ascii="Segoe UI" w:hAnsi="Segoe UI" w:cs="Segoe UI"/>
+        </w:rPr>
+      </w:pPr>
+      <w:r>
+        <w:rPr>
+          <w:b/>
+          <w:bCs/>
+        </w:rPr>
+        <w:t>Video Editing:</w:t>
+      </w:r>
+      <w:r>
+        <w:t xml:space="preserve"> </w:t>
+      </w:r>
+      <w:r>
+        <w:t>Experienced in video editing using different software’s</w:t>
+      </w:r>
+      <w:r>
+        <w:t>.</w:t>
+      </w:r>
+    </w:p>
+    <w:p>
+      <w:pPr>
+        <w:pStyle w:val="ListParagraph"/>
+        <w:numPr>
+          <w:ilvl w:val="0"/>
+          <w:numId w:val="9"/>
+        </w:numPr>
+        <w:spacing w:before="100" w:beforeAutospacing="1" w:after="100" w:afterAutospacing="1" w:line="240" w:lineRule="auto"/>
+        <w:rPr>
+          <w:rFonts w:ascii="Segoe UI" w:hAnsi="Segoe UI" w:cs="Segoe UI"/>
+        </w:rPr>
+      </w:pPr>
+      <w:r>
+        <w:rPr>
+          <w:b/>
+          <w:bCs/>
+        </w:rPr>
+        <w:t>Website Development:</w:t>
+      </w:r>
+      <w:r>
+        <w:t xml:space="preserve"> Skilled in website deve</w:t>
+      </w:r>
+      <w:r>
+        <w:t>lopment, including Wordpress</w:t>
+      </w:r>
+      <w:r>
+        <w:t>.</w:t>
+      </w:r>
     </w:p>
     <w:sectPr>
       <w:pgSz w:w="11907" w:h="16839" w:code="9"/>
@@ -1322,6 +2410,119 @@
 <file path=word/numbering.xml><?xml version="1.0" encoding="utf-8"?>
 <w:numbering xmlns:wpc="http://schemas.microsoft.com/office/word/2010/wordprocessingCanvas" xmlns:mc="http://schemas.openxmlformats.org/markup-compatibility/2006" xmlns:o="urn:schemas-microsoft-com:office:office" xmlns:r="http://schemas.openxmlformats.org/officeDocument/2006/relationships" xmlns:m="http://schemas.openxmlformats.org/officeDocument/2006/math" xmlns:v="urn:schemas-microsoft-com:vml" xmlns:wp14="http://schemas.microsoft.com/office/word/2010/wordprocessingDrawing" xmlns:wp="http://schemas.openxmlformats.org/drawingml/2006/wordprocessingDrawing" xmlns:w10="urn:schemas-microsoft-com:office:word" xmlns:w="http://schemas.openxmlformats.org/wordprocessingml/2006/main" xmlns:w14="http://schemas.microsoft.com/office/word/2010/wordml" xmlns:wpg="http://schemas.microsoft.com/office/word/2010/wordprocessingGroup" xmlns:wpi="http://schemas.microsoft.com/office/word/2010/wordprocessingInk" xmlns:wne="http://schemas.microsoft.com/office/word/2006/wordml" xmlns:wps="http://schemas.microsoft.com/office/word/2010/wordprocessingShape" mc:Ignorable="w14 wp14">
   <w:abstractNum w:abstractNumId="0">
+    <w:nsid w:val="0AE80BAC"/>
+    <w:multiLevelType w:val="hybridMultilevel"/>
+    <w:tmpl w:val="D7265BA0"/>
+    <w:lvl w:ilvl="0" w:tplc="04090001">
+      <w:start w:val="1"/>
+      <w:numFmt w:val="bullet"/>
+      <w:lvlText w:val=""/>
+      <w:lvlJc w:val="left"/>
+      <w:pPr>
+        <w:ind w:left="720" w:hanging="360"/>
+      </w:pPr>
+      <w:rPr>
+        <w:rFonts w:ascii="Symbol" w:hAnsi="Symbol" w:hint="default"/>
+      </w:rPr>
+    </w:lvl>
+    <w:lvl w:ilvl="1" w:tplc="04090003" w:tentative="1">
+      <w:start w:val="1"/>
+      <w:numFmt w:val="bullet"/>
+      <w:lvlText w:val="o"/>
+      <w:lvlJc w:val="left"/>
+      <w:pPr>
+        <w:ind w:left="1440" w:hanging="360"/>
+      </w:pPr>
+      <w:rPr>
+        <w:rFonts w:ascii="Courier New" w:hAnsi="Courier New" w:cs="Courier New" w:hint="default"/>
+      </w:rPr>
+    </w:lvl>
+    <w:lvl w:ilvl="2" w:tplc="04090005" w:tentative="1">
+      <w:start w:val="1"/>
+      <w:numFmt w:val="bullet"/>
+      <w:lvlText w:val=""/>
+      <w:lvlJc w:val="left"/>
+      <w:pPr>
+        <w:ind w:left="2160" w:hanging="360"/>
+      </w:pPr>
+      <w:rPr>
+        <w:rFonts w:ascii="Wingdings" w:hAnsi="Wingdings" w:hint="default"/>
+      </w:rPr>
+    </w:lvl>
+    <w:lvl w:ilvl="3" w:tplc="04090001" w:tentative="1">
+      <w:start w:val="1"/>
+      <w:numFmt w:val="bullet"/>
+      <w:lvlText w:val=""/>
+      <w:lvlJc w:val="left"/>
+      <w:pPr>
+        <w:ind w:left="2880" w:hanging="360"/>
+      </w:pPr>
+      <w:rPr>
+        <w:rFonts w:ascii="Symbol" w:hAnsi="Symbol" w:hint="default"/>
+      </w:rPr>
+    </w:lvl>
+    <w:lvl w:ilvl="4" w:tplc="04090003" w:tentative="1">
+      <w:start w:val="1"/>
+      <w:numFmt w:val="bullet"/>
+      <w:lvlText w:val="o"/>
+      <w:lvlJc w:val="left"/>
+      <w:pPr>
+        <w:ind w:left="3600" w:hanging="360"/>
+      </w:pPr>
+      <w:rPr>
+        <w:rFonts w:ascii="Courier New" w:hAnsi="Courier New" w:cs="Courier New" w:hint="default"/>
+      </w:rPr>
+    </w:lvl>
+    <w:lvl w:ilvl="5" w:tplc="04090005" w:tentative="1">
+      <w:start w:val="1"/>
+      <w:numFmt w:val="bullet"/>
+      <w:lvlText w:val=""/>
+      <w:lvlJc w:val="left"/>
+      <w:pPr>
+        <w:ind w:left="4320" w:hanging="360"/>
+      </w:pPr>
+      <w:rPr>
+        <w:rFonts w:ascii="Wingdings" w:hAnsi="Wingdings" w:hint="default"/>
+      </w:rPr>
+    </w:lvl>
+    <w:lvl w:ilvl="6" w:tplc="04090001" w:tentative="1">
+      <w:start w:val="1"/>
+      <w:numFmt w:val="bullet"/>
+      <w:lvlText w:val=""/>
+      <w:lvlJc w:val="left"/>
+      <w:pPr>
+        <w:ind w:left="5040" w:hanging="360"/>
+      </w:pPr>
+      <w:rPr>
+        <w:rFonts w:ascii="Symbol" w:hAnsi="Symbol" w:hint="default"/>
+      </w:rPr>
+    </w:lvl>
+    <w:lvl w:ilvl="7" w:tplc="04090003" w:tentative="1">
+      <w:start w:val="1"/>
+      <w:numFmt w:val="bullet"/>
+      <w:lvlText w:val="o"/>
+      <w:lvlJc w:val="left"/>
+      <w:pPr>
+        <w:ind w:left="5760" w:hanging="360"/>
+      </w:pPr>
+      <w:rPr>
+        <w:rFonts w:ascii="Courier New" w:hAnsi="Courier New" w:cs="Courier New" w:hint="default"/>
+      </w:rPr>
+    </w:lvl>
+    <w:lvl w:ilvl="8" w:tplc="04090005" w:tentative="1">
+      <w:start w:val="1"/>
+      <w:numFmt w:val="bullet"/>
+      <w:lvlText w:val=""/>
+      <w:lvlJc w:val="left"/>
+      <w:pPr>
+        <w:ind w:left="6480" w:hanging="360"/>
+      </w:pPr>
+      <w:rPr>
+        <w:rFonts w:ascii="Wingdings" w:hAnsi="Wingdings" w:hint="default"/>
+      </w:rPr>
+    </w:lvl>
+  </w:abstractNum>
+  <w:abstractNum w:abstractNumId="1">
     <w:nsid w:val="1CFA595F"/>
     <w:multiLevelType w:val="multilevel"/>
     <w:tmpl w:val="B5F60F58"/>
@@ -1470,7 +2671,7 @@
       </w:rPr>
     </w:lvl>
   </w:abstractNum>
-  <w:abstractNum w:abstractNumId="1">
+  <w:abstractNum w:abstractNumId="2">
     <w:nsid w:val="26E43257"/>
     <w:multiLevelType w:val="hybridMultilevel"/>
     <w:tmpl w:val="F9166C9A"/>
@@ -1583,7 +2784,7 @@
       </w:rPr>
     </w:lvl>
   </w:abstractNum>
-  <w:abstractNum w:abstractNumId="2">
+  <w:abstractNum w:abstractNumId="3">
     <w:nsid w:val="271F1621"/>
     <w:multiLevelType w:val="multilevel"/>
     <w:tmpl w:val="3CCCAF9C"/>
@@ -1732,7 +2933,7 @@
       </w:rPr>
     </w:lvl>
   </w:abstractNum>
-  <w:abstractNum w:abstractNumId="3">
+  <w:abstractNum w:abstractNumId="4">
     <w:nsid w:val="33F925AB"/>
     <w:multiLevelType w:val="multilevel"/>
     <w:tmpl w:val="AF4EF99E"/>
@@ -1881,7 +3082,319 @@
       </w:rPr>
     </w:lvl>
   </w:abstractNum>
-  <w:abstractNum w:abstractNumId="4">
+  <w:abstractNum w:abstractNumId="5">
+    <w:nsid w:val="589E6258"/>
+    <w:multiLevelType w:val="hybridMultilevel"/>
+    <w:tmpl w:val="13D65C66"/>
+    <w:lvl w:ilvl="0" w:tplc="04090001">
+      <w:start w:val="1"/>
+      <w:numFmt w:val="bullet"/>
+      <w:lvlText w:val=""/>
+      <w:lvlJc w:val="left"/>
+      <w:pPr>
+        <w:ind w:left="450" w:hanging="360"/>
+      </w:pPr>
+      <w:rPr>
+        <w:rFonts w:ascii="Symbol" w:hAnsi="Symbol" w:hint="default"/>
+      </w:rPr>
+    </w:lvl>
+    <w:lvl w:ilvl="1" w:tplc="04090003" w:tentative="1">
+      <w:start w:val="1"/>
+      <w:numFmt w:val="bullet"/>
+      <w:lvlText w:val="o"/>
+      <w:lvlJc w:val="left"/>
+      <w:pPr>
+        <w:ind w:left="1440" w:hanging="360"/>
+      </w:pPr>
+      <w:rPr>
+        <w:rFonts w:ascii="Courier New" w:hAnsi="Courier New" w:cs="Courier New" w:hint="default"/>
+      </w:rPr>
+    </w:lvl>
+    <w:lvl w:ilvl="2" w:tplc="04090005" w:tentative="1">
+      <w:start w:val="1"/>
+      <w:numFmt w:val="bullet"/>
+      <w:lvlText w:val=""/>
+      <w:lvlJc w:val="left"/>
+      <w:pPr>
+        <w:ind w:left="2160" w:hanging="360"/>
+      </w:pPr>
+      <w:rPr>
+        <w:rFonts w:ascii="Wingdings" w:hAnsi="Wingdings" w:hint="default"/>
+      </w:rPr>
+    </w:lvl>
+    <w:lvl w:ilvl="3" w:tplc="04090001" w:tentative="1">
+      <w:start w:val="1"/>
+      <w:numFmt w:val="bullet"/>
+      <w:lvlText w:val=""/>
+      <w:lvlJc w:val="left"/>
+      <w:pPr>
+        <w:ind w:left="2880" w:hanging="360"/>
+      </w:pPr>
+      <w:rPr>
+        <w:rFonts w:ascii="Symbol" w:hAnsi="Symbol" w:hint="default"/>
+      </w:rPr>
+    </w:lvl>
+    <w:lvl w:ilvl="4" w:tplc="04090003" w:tentative="1">
+      <w:start w:val="1"/>
+      <w:numFmt w:val="bullet"/>
+      <w:lvlText w:val="o"/>
+      <w:lvlJc w:val="left"/>
+      <w:pPr>
+        <w:ind w:left="3600" w:hanging="360"/>
+      </w:pPr>
+      <w:rPr>
+        <w:rFonts w:ascii="Courier New" w:hAnsi="Courier New" w:cs="Courier New" w:hint="default"/>
+      </w:rPr>
+    </w:lvl>
+    <w:lvl w:ilvl="5" w:tplc="04090005" w:tentative="1">
+      <w:start w:val="1"/>
+      <w:numFmt w:val="bullet"/>
+      <w:lvlText w:val=""/>
+      <w:lvlJc w:val="left"/>
+      <w:pPr>
+        <w:ind w:left="4320" w:hanging="360"/>
+      </w:pPr>
+      <w:rPr>
+        <w:rFonts w:ascii="Wingdings" w:hAnsi="Wingdings" w:hint="default"/>
+      </w:rPr>
+    </w:lvl>
+    <w:lvl w:ilvl="6" w:tplc="04090001" w:tentative="1">
+      <w:start w:val="1"/>
+      <w:numFmt w:val="bullet"/>
+      <w:lvlText w:val=""/>
+      <w:lvlJc w:val="left"/>
+      <w:pPr>
+        <w:ind w:left="5040" w:hanging="360"/>
+      </w:pPr>
+      <w:rPr>
+        <w:rFonts w:ascii="Symbol" w:hAnsi="Symbol" w:hint="default"/>
+      </w:rPr>
+    </w:lvl>
+    <w:lvl w:ilvl="7" w:tplc="04090003" w:tentative="1">
+      <w:start w:val="1"/>
+      <w:numFmt w:val="bullet"/>
+      <w:lvlText w:val="o"/>
+      <w:lvlJc w:val="left"/>
+      <w:pPr>
+        <w:ind w:left="5760" w:hanging="360"/>
+      </w:pPr>
+      <w:rPr>
+        <w:rFonts w:ascii="Courier New" w:hAnsi="Courier New" w:cs="Courier New" w:hint="default"/>
+      </w:rPr>
+    </w:lvl>
+    <w:lvl w:ilvl="8" w:tplc="04090005" w:tentative="1">
+      <w:start w:val="1"/>
+      <w:numFmt w:val="bullet"/>
+      <w:lvlText w:val=""/>
+      <w:lvlJc w:val="left"/>
+      <w:pPr>
+        <w:ind w:left="6480" w:hanging="360"/>
+      </w:pPr>
+      <w:rPr>
+        <w:rFonts w:ascii="Wingdings" w:hAnsi="Wingdings" w:hint="default"/>
+      </w:rPr>
+    </w:lvl>
+  </w:abstractNum>
+  <w:abstractNum w:abstractNumId="6">
+    <w:nsid w:val="5D432BAE"/>
+    <w:multiLevelType w:val="hybridMultilevel"/>
+    <w:tmpl w:val="CBA87014"/>
+    <w:lvl w:ilvl="0" w:tplc="04090001">
+      <w:start w:val="1"/>
+      <w:numFmt w:val="bullet"/>
+      <w:lvlText w:val=""/>
+      <w:lvlJc w:val="left"/>
+      <w:pPr>
+        <w:ind w:left="450" w:hanging="360"/>
+      </w:pPr>
+      <w:rPr>
+        <w:rFonts w:ascii="Symbol" w:hAnsi="Symbol" w:hint="default"/>
+      </w:rPr>
+    </w:lvl>
+    <w:lvl w:ilvl="1" w:tplc="04090003" w:tentative="1">
+      <w:start w:val="1"/>
+      <w:numFmt w:val="bullet"/>
+      <w:lvlText w:val="o"/>
+      <w:lvlJc w:val="left"/>
+      <w:pPr>
+        <w:ind w:left="1440" w:hanging="360"/>
+      </w:pPr>
+      <w:rPr>
+        <w:rFonts w:ascii="Courier New" w:hAnsi="Courier New" w:cs="Courier New" w:hint="default"/>
+      </w:rPr>
+    </w:lvl>
+    <w:lvl w:ilvl="2" w:tplc="04090005" w:tentative="1">
+      <w:start w:val="1"/>
+      <w:numFmt w:val="bullet"/>
+      <w:lvlText w:val=""/>
+      <w:lvlJc w:val="left"/>
+      <w:pPr>
+        <w:ind w:left="2160" w:hanging="360"/>
+      </w:pPr>
+      <w:rPr>
+        <w:rFonts w:ascii="Wingdings" w:hAnsi="Wingdings" w:hint="default"/>
+      </w:rPr>
+    </w:lvl>
+    <w:lvl w:ilvl="3" w:tplc="04090001" w:tentative="1">
+      <w:start w:val="1"/>
+      <w:numFmt w:val="bullet"/>
+      <w:lvlText w:val=""/>
+      <w:lvlJc w:val="left"/>
+      <w:pPr>
+        <w:ind w:left="2880" w:hanging="360"/>
+      </w:pPr>
+      <w:rPr>
+        <w:rFonts w:ascii="Symbol" w:hAnsi="Symbol" w:hint="default"/>
+      </w:rPr>
+    </w:lvl>
+    <w:lvl w:ilvl="4" w:tplc="04090003" w:tentative="1">
+      <w:start w:val="1"/>
+      <w:numFmt w:val="bullet"/>
+      <w:lvlText w:val="o"/>
+      <w:lvlJc w:val="left"/>
+      <w:pPr>
+        <w:ind w:left="3600" w:hanging="360"/>
+      </w:pPr>
+      <w:rPr>
+        <w:rFonts w:ascii="Courier New" w:hAnsi="Courier New" w:cs="Courier New" w:hint="default"/>
+      </w:rPr>
+    </w:lvl>
+    <w:lvl w:ilvl="5" w:tplc="04090005" w:tentative="1">
+      <w:start w:val="1"/>
+      <w:numFmt w:val="bullet"/>
+      <w:lvlText w:val=""/>
+      <w:lvlJc w:val="left"/>
+      <w:pPr>
+        <w:ind w:left="4320" w:hanging="360"/>
+      </w:pPr>
+      <w:rPr>
+        <w:rFonts w:ascii="Wingdings" w:hAnsi="Wingdings" w:hint="default"/>
+      </w:rPr>
+    </w:lvl>
+    <w:lvl w:ilvl="6" w:tplc="04090001" w:tentative="1">
+      <w:start w:val="1"/>
+      <w:numFmt w:val="bullet"/>
+      <w:lvlText w:val=""/>
+      <w:lvlJc w:val="left"/>
+      <w:pPr>
+        <w:ind w:left="5040" w:hanging="360"/>
+      </w:pPr>
+      <w:rPr>
+        <w:rFonts w:ascii="Symbol" w:hAnsi="Symbol" w:hint="default"/>
+      </w:rPr>
+    </w:lvl>
+    <w:lvl w:ilvl="7" w:tplc="04090003" w:tentative="1">
+      <w:start w:val="1"/>
+      <w:numFmt w:val="bullet"/>
+      <w:lvlText w:val="o"/>
+      <w:lvlJc w:val="left"/>
+      <w:pPr>
+        <w:ind w:left="5760" w:hanging="360"/>
+      </w:pPr>
+      <w:rPr>
+        <w:rFonts w:ascii="Courier New" w:hAnsi="Courier New" w:cs="Courier New" w:hint="default"/>
+      </w:rPr>
+    </w:lvl>
+    <w:lvl w:ilvl="8" w:tplc="04090005" w:tentative="1">
+      <w:start w:val="1"/>
+      <w:numFmt w:val="bullet"/>
+      <w:lvlText w:val=""/>
+      <w:lvlJc w:val="left"/>
+      <w:pPr>
+        <w:ind w:left="6480" w:hanging="360"/>
+      </w:pPr>
+      <w:rPr>
+        <w:rFonts w:ascii="Wingdings" w:hAnsi="Wingdings" w:hint="default"/>
+      </w:rPr>
+    </w:lvl>
+  </w:abstractNum>
+  <w:abstractNum w:abstractNumId="7">
+    <w:nsid w:val="648A5CD4"/>
+    <w:multiLevelType w:val="hybridMultilevel"/>
+    <w:tmpl w:val="E7043CB6"/>
+    <w:lvl w:ilvl="0" w:tplc="0409000F">
+      <w:start w:val="1"/>
+      <w:numFmt w:val="decimal"/>
+      <w:lvlText w:val="%1."/>
+      <w:lvlJc w:val="left"/>
+      <w:pPr>
+        <w:ind w:left="360" w:hanging="360"/>
+      </w:pPr>
+    </w:lvl>
+    <w:lvl w:ilvl="1" w:tplc="04090019" w:tentative="1">
+      <w:start w:val="1"/>
+      <w:numFmt w:val="lowerLetter"/>
+      <w:lvlText w:val="%2."/>
+      <w:lvlJc w:val="left"/>
+      <w:pPr>
+        <w:ind w:left="1080" w:hanging="360"/>
+      </w:pPr>
+    </w:lvl>
+    <w:lvl w:ilvl="2" w:tplc="0409001B" w:tentative="1">
+      <w:start w:val="1"/>
+      <w:numFmt w:val="lowerRoman"/>
+      <w:lvlText w:val="%3."/>
+      <w:lvlJc w:val="right"/>
+      <w:pPr>
+        <w:ind w:left="1800" w:hanging="180"/>
+      </w:pPr>
+    </w:lvl>
+    <w:lvl w:ilvl="3" w:tplc="0409000F" w:tentative="1">
+      <w:start w:val="1"/>
+      <w:numFmt w:val="decimal"/>
+      <w:lvlText w:val="%4."/>
+      <w:lvlJc w:val="left"/>
+      <w:pPr>
+        <w:ind w:left="2520" w:hanging="360"/>
+      </w:pPr>
+    </w:lvl>
+    <w:lvl w:ilvl="4" w:tplc="04090019" w:tentative="1">
+      <w:start w:val="1"/>
+      <w:numFmt w:val="lowerLetter"/>
+      <w:lvlText w:val="%5."/>
+      <w:lvlJc w:val="left"/>
+      <w:pPr>
+        <w:ind w:left="3240" w:hanging="360"/>
+      </w:pPr>
+    </w:lvl>
+    <w:lvl w:ilvl="5" w:tplc="0409001B" w:tentative="1">
+      <w:start w:val="1"/>
+      <w:numFmt w:val="lowerRoman"/>
+      <w:lvlText w:val="%6."/>
+      <w:lvlJc w:val="right"/>
+      <w:pPr>
+        <w:ind w:left="3960" w:hanging="180"/>
+      </w:pPr>
+    </w:lvl>
+    <w:lvl w:ilvl="6" w:tplc="0409000F" w:tentative="1">
+      <w:start w:val="1"/>
+      <w:numFmt w:val="decimal"/>
+      <w:lvlText w:val="%7."/>
+      <w:lvlJc w:val="left"/>
+      <w:pPr>
+        <w:ind w:left="4680" w:hanging="360"/>
+      </w:pPr>
+    </w:lvl>
+    <w:lvl w:ilvl="7" w:tplc="04090019" w:tentative="1">
+      <w:start w:val="1"/>
+      <w:numFmt w:val="lowerLetter"/>
+      <w:lvlText w:val="%8."/>
+      <w:lvlJc w:val="left"/>
+      <w:pPr>
+        <w:ind w:left="5400" w:hanging="360"/>
+      </w:pPr>
+    </w:lvl>
+    <w:lvl w:ilvl="8" w:tplc="0409001B" w:tentative="1">
+      <w:start w:val="1"/>
+      <w:numFmt w:val="lowerRoman"/>
+      <w:lvlText w:val="%9."/>
+      <w:lvlJc w:val="right"/>
+      <w:pPr>
+        <w:ind w:left="6120" w:hanging="180"/>
+      </w:pPr>
+    </w:lvl>
+  </w:abstractNum>
+  <w:abstractNum w:abstractNumId="8">
     <w:nsid w:val="7A277F4C"/>
     <w:multiLevelType w:val="hybridMultilevel"/>
     <w:tmpl w:val="CAF80C18"/>
@@ -1995,19 +3508,31 @@
     </w:lvl>
   </w:abstractNum>
   <w:num w:numId="1">
+    <w:abstractNumId w:val="8"/>
+  </w:num>
+  <w:num w:numId="2">
     <w:abstractNumId w:val="4"/>
   </w:num>
-  <w:num w:numId="2">
+  <w:num w:numId="3">
     <w:abstractNumId w:val="3"/>
   </w:num>
-  <w:num w:numId="3">
+  <w:num w:numId="4">
+    <w:abstractNumId w:val="1"/>
+  </w:num>
+  <w:num w:numId="5">
     <w:abstractNumId w:val="2"/>
   </w:num>
-  <w:num w:numId="4">
+  <w:num w:numId="6">
+    <w:abstractNumId w:val="5"/>
+  </w:num>
+  <w:num w:numId="7">
     <w:abstractNumId w:val="0"/>
   </w:num>
-  <w:num w:numId="5">
-    <w:abstractNumId w:val="1"/>
+  <w:num w:numId="8">
+    <w:abstractNumId w:val="6"/>
+  </w:num>
+  <w:num w:numId="9">
+    <w:abstractNumId w:val="7"/>
   </w:num>
 </w:numbering>
 </file>
@@ -3159,7 +4684,7 @@
   <a:extraClrSchemeLst/>
   <a:extLst>
     <a:ext uri="{05A4C25C-085E-4340-85A3-A5531E510DB2}">
-      <thm15:themeFamily xmlns:thm15="http://schemas.microsoft.com/office/thememl/2012/main" xmlns="" name="Office Theme" id="{62F939B6-93AF-4DB8-9C6B-D6C7DFDC589F}" vid="{4A3C46E8-61CC-4603-A589-7422A47A8E4A}"/>
+      <thm15:themeFamily xmlns="" xmlns:thm15="http://schemas.microsoft.com/office/thememl/2012/main" name="Office Theme" id="{62F939B6-93AF-4DB8-9C6B-D6C7DFDC589F}" vid="{4A3C46E8-61CC-4603-A589-7422A47A8E4A}"/>
     </a:ext>
   </a:extLst>
 </a:theme>

</xml_diff>

<commit_message>
Education changing commit pdf
</commit_message>
<xml_diff>
--- a/cv.docx
+++ b/cv.docx
@@ -1511,7 +1511,6 @@
           <w:szCs w:val="24"/>
         </w:rPr>
       </w:pPr>
-      <w:bookmarkStart w:id="0" w:name="_GoBack"/>
       <w:r>
         <w:rPr>
           <w:rFonts w:ascii="Bahnschrift" w:hAnsi="Bahnschrift"/>
@@ -1523,7 +1522,6 @@
         <w:t>Web Developer | Bright Eaglets Colleges Jhang | Jan 20222- DEC 2022</w:t>
       </w:r>
     </w:p>
-    <w:bookmarkEnd w:id="0"/>
     <w:p>
       <w:pPr>
         <w:pStyle w:val="ListParagraph"/>
@@ -2196,7 +2194,15 @@
               <w:rPr>
                 <w:rFonts w:ascii="Segoe UI" w:hAnsi="Segoe UI" w:cs="Segoe UI"/>
               </w:rPr>
-              <w:t xml:space="preserve">BISE </w:t>
+              <w:t>GC</w:t>
+            </w:r>
+            <w:bookmarkStart w:id="0" w:name="_GoBack"/>
+            <w:bookmarkEnd w:id="0"/>
+            <w:r>
+              <w:rPr>
+                <w:rFonts w:ascii="Segoe UI" w:hAnsi="Segoe UI" w:cs="Segoe UI"/>
+              </w:rPr>
+              <w:t xml:space="preserve"> </w:t>
             </w:r>
             <w:r>
               <w:t xml:space="preserve"> </w:t>
@@ -2301,10 +2307,7 @@
         <w:t>DSA</w:t>
       </w:r>
       <w:r>
-        <w:t xml:space="preserve">, as well </w:t>
-      </w:r>
-      <w:r>
-        <w:t>as HTML, CSS, and JavaScript.</w:t>
+        <w:t>, as well as HTML, CSS, and JavaScript.</w:t>
       </w:r>
     </w:p>
     <w:p>
@@ -2359,10 +2362,7 @@
         <w:t>Video Editing:</w:t>
       </w:r>
       <w:r>
-        <w:t xml:space="preserve"> </w:t>
-      </w:r>
-      <w:r>
-        <w:t>Experienced in video editing using different software’s</w:t>
+        <w:t xml:space="preserve"> Experienced in video editing using different software’s</w:t>
       </w:r>
       <w:r>
         <w:t>.</w:t>
@@ -2388,10 +2388,7 @@
         <w:t>Website Development:</w:t>
       </w:r>
       <w:r>
-        <w:t xml:space="preserve"> Skilled in website deve</w:t>
-      </w:r>
-      <w:r>
-        <w:t>lopment, including Wordpress</w:t>
+        <w:t xml:space="preserve"> Skilled in website development, including Wordpress</w:t>
       </w:r>
       <w:r>
         <w:t>.</w:t>
@@ -4684,7 +4681,7 @@
   <a:extraClrSchemeLst/>
   <a:extLst>
     <a:ext uri="{05A4C25C-085E-4340-85A3-A5531E510DB2}">
-      <thm15:themeFamily xmlns="" xmlns:thm15="http://schemas.microsoft.com/office/thememl/2012/main" name="Office Theme" id="{62F939B6-93AF-4DB8-9C6B-D6C7DFDC589F}" vid="{4A3C46E8-61CC-4603-A589-7422A47A8E4A}"/>
+      <thm15:themeFamily xmlns:thm15="http://schemas.microsoft.com/office/thememl/2012/main" xmlns="" name="Office Theme" id="{62F939B6-93AF-4DB8-9C6B-D6C7DFDC589F}" vid="{4A3C46E8-61CC-4603-A589-7422A47A8E4A}"/>
     </a:ext>
   </a:extLst>
 </a:theme>

</xml_diff>